<commit_message>
Taller 8: actualizo credenciales y emparejamiento
</commit_message>
<xml_diff>
--- a/docs/Taller8_Arquitectura.docx
+++ b/docs/Taller8_Arquitectura.docx
@@ -5887,7 +5887,7 @@
                 <w:rFonts w:ascii="Calibri" w:hAnsi="Calibri" w:cs="Calibri" w:eastAsia="Calibri"/>
                 <w:sz w:val="17"/>
               </w:rPr>
-              <w:t>Leer los contactos y el PIR. Filtrar rebotes (50 ms), bloquear el PIR 8 s entre eventos y 45 s al arrancar. Buscar el canal del concentrador (canales 1 a 13) y reintentar. Enviar eventos y un estado cada 30 s con número de secuencia. Cifrar con AES-CCM si se activa.</w:t>
+              <w:t>Leer los contactos y el PIR. Filtrar rebotes (50 ms), bloquear el PIR 8 s entre eventos y 45 s al arrancar. Emparejarse con el concentrador (la MAC se guarda en la memoria no volátil) y buscar su canal (1 a 13). Enviar eventos y un estado cada 30 s con número de secuencia. Cifrar con AES-CCM si se activa.</w:t>
             </w:r>
           </w:p>
         </w:tc>
@@ -5981,7 +5981,7 @@
                 <w:rFonts w:ascii="Calibri" w:hAnsi="Calibri" w:cs="Calibri" w:eastAsia="Calibri"/>
                 <w:sz w:val="17"/>
               </w:rPr>
-              <w:t>Recibir los paquetes, descartar duplicados y nodos no permitidos. Decidir la alarma con el estado armado, el modo silencioso y el tiempo. Activar la sirena 30 s. Consultar el estado al backend cada 2 s. Enviar la alarma antes que la medición, con 3 reintentos. Guardar hasta 20 eventos en RAM sin conexión. Enviar el latido de nodos cada 30 s. Reconectar el Wi-Fi sin bloquear.</w:t>
+              <w:t>Guardar Wi-Fi, token y servidor por comandos seriales. Emparejar nodos y recibir sus paquetes, descartando duplicados y nodos no emparejados. Decidir la alarma con el estado armado, el modo silencioso y el tiempo. Activar la sirena 30 s. Consultar el estado al backend cada 2 s. Enviar la alarma antes que la medición, con 3 reintentos. Guardar hasta 20 eventos en RAM sin conexión. Enviar el latido de nodos cada 30 s. Reconectar el Wi-Fi sin bloquear.</w:t>
             </w:r>
           </w:p>
         </w:tc>
@@ -8144,7 +8144,7 @@
                 <w:rFonts w:ascii="Calibri" w:hAnsi="Calibri" w:cs="Calibri" w:eastAsia="Calibri"/>
                 <w:sz w:val="17"/>
               </w:rPr>
-              <w:t>Lista de MAC permitidas. AES-CCM opcional (PMK y LMK de 16 caracteres), hasta 6 pares cifrados. De fábrica desactivado</w:t>
+              <w:t>Lista de nodos emparejados (MAC guardadas en la memoria no volátil). AES-CCM opcional (PMK y LMK de 16 caracteres), hasta 6 pares cifrados. De fábrica desactivado</w:t>
             </w:r>
           </w:p>
         </w:tc>
@@ -9949,7 +9949,7 @@
                 <w:rFonts w:ascii="Calibri" w:hAnsi="Calibri" w:cs="Calibri" w:eastAsia="Calibri"/>
                 <w:sz w:val="18"/>
               </w:rPr>
-              <w:t>1 evento, 2 estado periódico, 3 hola (prueba de canal, se ignora)</w:t>
+              <w:t>1 evento, 2 estado periódico, 3 hola (prueba de canal), 4 emparejar (petición del nodo), 5 respuesta del concentrador</w:t>
             </w:r>
           </w:p>
         </w:tc>
@@ -14360,7 +14360,7 @@
           <w:rFonts w:ascii="Calibri" w:hAnsi="Calibri" w:cs="Calibri" w:eastAsia="Calibri"/>
           <w:sz w:val="22"/>
         </w:rPr>
-        <w:t xml:space="preserve"> Los nodos no se autentican ante el backend, porque no hablan con él; se autentican ante el concentrador por su dirección MAC y, si se activa, por cifrado ESP-NOW. El cifrado de ese enlace está desactivado y es la mejora más importante de la capa embebida.</w:t>
+        <w:t xml:space="preserve"> Los nodos no se autentican ante el backend, porque no hablan con él; se autentican ante el concentrador porque este solo acepta las MAC que emparejó (comando emparejar, ventana de 2 minutos) y, si se activa, por cifrado ESP-NOW. El cifrado de ese enlace está desactivado y es la mejora más importante de la capa embebida.</w:t>
       </w:r>
     </w:p>
     <w:p>
@@ -14403,7 +14403,7 @@
           <w:rFonts w:ascii="Calibri" w:hAnsi="Calibri" w:cs="Calibri" w:eastAsia="Calibri"/>
           <w:sz w:val="22"/>
         </w:rPr>
-        <w:t>. Los secretos del servidor van en un archivo .env fuera del control de versiones y los del firmware se escriben localmente antes de compilar.</w:t>
+        <w:t>. Los secretos del servidor van en un archivo .env fuera del control de versiones y los del firmware se escriben por el puerto serie y quedan en la memoria no volátil de la placa, sin recompilar.</w:t>
       </w:r>
     </w:p>
     <w:p>
@@ -15353,7 +15353,7 @@
                 <w:rFonts w:ascii="Calibri" w:hAnsi="Calibri" w:cs="Calibri" w:eastAsia="Calibri"/>
                 <w:sz w:val="17"/>
               </w:rPr>
-              <w:t>Constantes en el firmware, compiladas localmente</w:t>
+              <w:t>Memoria no volátil (NVS) de la placa, escritos por comandos seriales</w:t>
             </w:r>
           </w:p>
         </w:tc>
@@ -15411,7 +15411,7 @@
                 <w:rFonts w:ascii="Calibri" w:hAnsi="Calibri" w:cs="Calibri" w:eastAsia="Calibri"/>
                 <w:sz w:val="17"/>
               </w:rPr>
-              <w:t>En el repositorio solo hay marcadores de posición</w:t>
+              <w:t>El código no contiene ningún valor; el comando ver los muestra ocultos</w:t>
             </w:r>
           </w:p>
         </w:tc>
@@ -15475,7 +15475,7 @@
                 <w:rFonts w:ascii="Calibri" w:hAnsi="Calibri" w:cs="Calibri" w:eastAsia="Calibri"/>
                 <w:sz w:val="17"/>
               </w:rPr>
-              <w:t>Constantes en el firmware</w:t>
+              <w:t>Constantes en el firmware (opcional)</w:t>
             </w:r>
           </w:p>
         </w:tc>
@@ -15575,7 +15575,7 @@
           <w:rFonts w:ascii="Calibri" w:hAnsi="Calibri" w:cs="Calibri" w:eastAsia="Calibri"/>
           <w:sz w:val="22"/>
         </w:rPr>
-        <w:t xml:space="preserve"> Mientras el firmware lleve el Wi-Fi y el token como constantes, quien tenga el binario o la placa puede extraerlos. La mejora prevista es guardarlos en la memoria no volátil (NVS) y cargarlos por un modo de configuración, de modo que el código fuente nunca los contenga; hoy se mitiga con el marcador de posición y la rotación del token. Debe repetirse la búsqueda de patrones sobre el historial de Git antes de la entrega.</w:t>
+        <w:t xml:space="preserve"> El Wi-Fi y el token ya no están en el código fuente ni en el binario: se escriben por comandos seriales (wifi, clave, token, servidor) y viven en la memoria no volátil. Queda el riesgo de que quien tenga la placa los lea de la flash, porque aún no se activa el cifrado de flash; se mitiga con la rotación del token desde la aplicación. Debe repetirse la búsqueda de patrones sobre el historial de Git antes de la entrega.</w:t>
       </w:r>
     </w:p>
     <w:p>
@@ -16342,7 +16342,7 @@
                 <w:rFonts w:ascii="Calibri" w:hAnsi="Calibri" w:cs="Calibri" w:eastAsia="Calibri"/>
                 <w:sz w:val="17"/>
               </w:rPr>
-              <w:t>Pierde el enlace; tras 3 envíos fallidos vuelve a buscar el canal (1 a 13) y reenvía su estado cada 30 s, lo que le devuelve al concentrador el estado de los sensores</w:t>
+              <w:t>Pierde el enlace; tras 3 envíos fallidos vuelve a buscar el canal (1 a 13; no repite el emparejamiento) y reenvía su estado cada 30 s, lo que le devuelve al concentrador el estado de los sensores</w:t>
             </w:r>
           </w:p>
         </w:tc>
@@ -18433,7 +18433,7 @@
           <w:rFonts w:ascii="Calibri" w:hAnsi="Calibri" w:cs="Calibri" w:eastAsia="Calibri"/>
           <w:sz w:val="22"/>
         </w:rPr>
-        <w:t xml:space="preserve"> El token viaja sin cifrar por Internet en la configuración actual. Debe pasarse a HTTPS (USAR_HTTPS) cuando el certificado del dominio del firmware esté disponible.</w:t>
+        <w:t xml:space="preserve"> El token viaja sin cifrar por Internet en la configuración actual. Se activa con solo escribir una URL https:// en el comando servidor, cuando el certificado del dominio del firmware esté disponible.</w:t>
       </w:r>
     </w:p>
     <w:p>

</xml_diff>